<commit_message>
docs: add global 3-tier architecture diagram and inter-layer protocols matrix
</commit_message>
<xml_diff>
--- a/docs/rapport-fusion-p1-p2-p4.docx
+++ b/docs/rapport-fusion-p1-p2-p4.docx
@@ -1043,6 +1043,1189 @@
           <ns0:b/>
         </ns0:rPr>
         <ns0:t>3.1 Schéma Architectural d'Ensemble</ns0:t>
+      </ns0:r>
+    </ns0:p>
+    <ns0:p>
+      <ns0:pPr/>
+      <ns0:r>
+        <ns0:rPr/>
+        <ns0:t>Le schéma ci-dessous illustre l'agencement modulaire de la plateforme VIZENTRA, la séparation stricte des trois tiers et les canaux de communication inter-composants :</ns0:t>
+      </ns0:r>
+    </ns0:p>
+    <ns0:tbl>
+      <ns0:tblPr>
+        <ns0:tblW ns0:w="9600" ns0:type="dxa"/>
+        <ns0:tblBorders>
+          <ns0:top ns0:val="single" ns0:sz="8" ns0:space="0" ns0:color="1F4E79"/>
+          <ns0:left ns0:val="single" ns0:sz="8" ns0:space="0" ns0:color="1F4E79"/>
+          <ns0:bottom ns0:val="single" ns0:sz="8" ns0:space="0" ns0:color="1F4E79"/>
+          <ns0:right ns0:val="single" ns0:sz="8" ns0:space="0" ns0:color="1F4E79"/>
+        </ns0:tblBorders>
+      </ns0:tblPr>
+      <ns0:tr>
+        <ns0:tc>
+          <ns0:tcPr>
+            <ns0:shd ns0:val="clear" ns0:color="auto" ns0:fill="F4F7FB"/>
+            <ns0:tcMar>
+              <ns0:top ns0:w="180" ns0:type="dxa"/>
+              <ns0:bottom ns0:w="180" ns0:type="dxa"/>
+              <ns0:left ns0:w="180" ns0:type="dxa"/>
+              <ns0:right ns0:w="180" ns0:type="dxa"/>
+            </ns0:tcMar>
+          </ns0:tcPr>
+          <ns0:p>
+            <ns0:pPr>
+              <ns0:spacing ns0:after="20" ns0:before="20"/>
+            </ns0:pPr>
+            <ns0:r>
+              <ns0:rPr>
+                <ns0:rFonts ns0:ascii="Consolas" ns0:hAnsi="Consolas"/>
+                <ns0:color ns0:val="1F4E79"/>
+                <ns0:sz ns0:val="15"/>
+              </ns0:rPr>
+              <ns0:t>+-----------------------------------------------------------------------------------------+</ns0:t>
+            </ns0:r>
+          </ns0:p>
+          <ns0:p>
+            <ns0:pPr>
+              <ns0:spacing ns0:after="20" ns0:before="20"/>
+            </ns0:pPr>
+            <ns0:r>
+              <ns0:rPr>
+                <ns0:rFonts ns0:ascii="Consolas" ns0:hAnsi="Consolas"/>
+                <ns0:color ns0:val="1F4E79"/>
+                <ns0:sz ns0:val="15"/>
+              </ns0:rPr>
+              <ns0:t>|                        TIER 1 : FRONT-END (React 18 + Vite SPA)                         |</ns0:t>
+            </ns0:r>
+          </ns0:p>
+          <ns0:p>
+            <ns0:pPr>
+              <ns0:spacing ns0:after="20" ns0:before="20"/>
+            </ns0:pPr>
+            <ns0:r>
+              <ns0:rPr>
+                <ns0:rFonts ns0:ascii="Consolas" ns0:hAnsi="Consolas"/>
+                <ns0:color ns0:val="1F4E79"/>
+                <ns0:sz ns0:val="15"/>
+              </ns0:rPr>
+              <ns0:t>|   +---------------------------------------------------------------------------------+   |</ns0:t>
+            </ns0:r>
+          </ns0:p>
+          <ns0:p>
+            <ns0:pPr>
+              <ns0:spacing ns0:after="20" ns0:before="20"/>
+            </ns0:pPr>
+            <ns0:r>
+              <ns0:rPr>
+                <ns0:rFonts ns0:ascii="Consolas" ns0:hAnsi="Consolas"/>
+                <ns0:color ns0:val="1F4E79"/>
+                <ns0:sz ns0:val="15"/>
+              </ns0:rPr>
+              <ns0:t>|   |  React Router v6  ·  AuthContext (JWT State)  ·  Client Axios avec Intercepteur |   |</ns0:t>
+            </ns0:r>
+          </ns0:p>
+          <ns0:p>
+            <ns0:pPr>
+              <ns0:spacing ns0:after="20" ns0:before="20"/>
+            </ns0:pPr>
+            <ns0:r>
+              <ns0:rPr>
+                <ns0:rFonts ns0:ascii="Consolas" ns0:hAnsi="Consolas"/>
+                <ns0:color ns0:val="1F4E79"/>
+                <ns0:sz ns0:val="15"/>
+              </ns0:rPr>
+              <ns0:t>|   +---------------------------------------------------------------------------------+   |</ns0:t>
+            </ns0:r>
+          </ns0:p>
+          <ns0:p>
+            <ns0:pPr>
+              <ns0:spacing ns0:after="20" ns0:before="20"/>
+            </ns0:pPr>
+            <ns0:r>
+              <ns0:rPr>
+                <ns0:rFonts ns0:ascii="Consolas" ns0:hAnsi="Consolas"/>
+                <ns0:color ns0:val="1F4E79"/>
+                <ns0:sz ns0:val="15"/>
+              </ns0:rPr>
+              <ns0:t>|       |                       |                      |                     |            |</ns0:t>
+            </ns0:r>
+          </ns0:p>
+          <ns0:p>
+            <ns0:pPr>
+              <ns0:spacing ns0:after="20" ns0:before="20"/>
+            </ns0:pPr>
+            <ns0:r>
+              <ns0:rPr>
+                <ns0:rFonts ns0:ascii="Consolas" ns0:hAnsi="Consolas"/>
+                <ns0:color ns0:val="1F4E79"/>
+                <ns0:sz ns0:val="15"/>
+              </ns0:rPr>
+              <ns0:t>|  [P1: Auth/Admin]      [P2: Datasets]        [P3: Analytics]        [P4: Dashboards]    |</ns0:t>
+            </ns0:r>
+          </ns0:p>
+          <ns0:p>
+            <ns0:pPr>
+              <ns0:spacing ns0:after="20" ns0:before="20"/>
+            </ns0:pPr>
+            <ns0:r>
+              <ns0:rPr>
+                <ns0:rFonts ns0:ascii="Consolas" ns0:hAnsi="Consolas"/>
+                <ns0:color ns0:val="1F4E79"/>
+                <ns0:sz ns0:val="15"/>
+              </ns0:rPr>
+              <ns0:t>|  Connexion, Profil,    Upload CSV/JSON,      Moteur requetes,       Editeur widgets,    |</ns0:t>
+            </ns0:r>
+          </ns0:p>
+          <ns0:p>
+            <ns0:pPr>
+              <ns0:spacing ns0:after="20" ns0:before="20"/>
+            </ns0:pPr>
+            <ns0:r>
+              <ns0:rPr>
+                <ns0:rFonts ns0:ascii="Consolas" ns0:hAnsi="Consolas"/>
+                <ns0:color ns0:val="1F4E79"/>
+                <ns0:sz ns0:val="15"/>
+              </ns0:rPr>
+              <ns0:t>|  Console Supervision   Profilage qualite     Agregations, Recharts  Filtres, Outliers   |</ns0:t>
+            </ns0:r>
+          </ns0:p>
+          <ns0:p>
+            <ns0:pPr>
+              <ns0:spacing ns0:after="20" ns0:before="20"/>
+            </ns0:pPr>
+            <ns0:r>
+              <ns0:rPr>
+                <ns0:rFonts ns0:ascii="Consolas" ns0:hAnsi="Consolas"/>
+                <ns0:color ns0:val="1F4E79"/>
+                <ns0:sz ns0:val="15"/>
+              </ns0:rPr>
+              <ns0:t>+-------+-----------------------+----------------------+---------------------+------------+</ns0:t>
+            </ns0:r>
+          </ns0:p>
+          <ns0:p>
+            <ns0:pPr>
+              <ns0:spacing ns0:after="20" ns0:before="20"/>
+            </ns0:pPr>
+            <ns0:r>
+              <ns0:rPr>
+                <ns0:rFonts ns0:ascii="Consolas" ns0:hAnsi="Consolas"/>
+                <ns0:color ns0:val="1F4E79"/>
+                <ns0:sz ns0:val="15"/>
+              </ns0:rPr>
+              <ns0:t xml:space="preserve">        |                       |                      |                     |             </ns0:t>
+            </ns0:r>
+          </ns0:p>
+          <ns0:p>
+            <ns0:pPr>
+              <ns0:spacing ns0:after="20" ns0:before="20"/>
+            </ns0:pPr>
+            <ns0:r>
+              <ns0:rPr>
+                <ns0:rFonts ns0:ascii="Consolas" ns0:hAnsi="Consolas"/>
+                <ns0:color ns0:val="1F4E79"/>
+                <ns0:sz ns0:val="15"/>
+              </ns0:rPr>
+              <ns0:t xml:space="preserve">        | HTTP REST + Bearer JWT                       |                     |             </ns0:t>
+            </ns0:r>
+          </ns0:p>
+          <ns0:p>
+            <ns0:pPr>
+              <ns0:spacing ns0:after="20" ns0:before="20"/>
+            </ns0:pPr>
+            <ns0:r>
+              <ns0:rPr>
+                <ns0:rFonts ns0:ascii="Consolas" ns0:hAnsi="Consolas"/>
+                <ns0:color ns0:val="1F4E79"/>
+                <ns0:sz ns0:val="15"/>
+              </ns0:rPr>
+              <ns0:t xml:space="preserve">        v                       v                      v                     v             </ns0:t>
+            </ns0:r>
+          </ns0:p>
+          <ns0:p>
+            <ns0:pPr>
+              <ns0:spacing ns0:after="20" ns0:before="20"/>
+            </ns0:pPr>
+            <ns0:r>
+              <ns0:rPr>
+                <ns0:rFonts ns0:ascii="Consolas" ns0:hAnsi="Consolas"/>
+                <ns0:color ns0:val="1F4E79"/>
+                <ns0:sz ns0:val="15"/>
+              </ns0:rPr>
+              <ns0:t>+-----------------------------------------------------------------------------------------+</ns0:t>
+            </ns0:r>
+          </ns0:p>
+          <ns0:p>
+            <ns0:pPr>
+              <ns0:spacing ns0:after="20" ns0:before="20"/>
+            </ns0:pPr>
+            <ns0:r>
+              <ns0:rPr>
+                <ns0:rFonts ns0:ascii="Consolas" ns0:hAnsi="Consolas"/>
+                <ns0:color ns0:val="1F4E79"/>
+                <ns0:sz ns0:val="15"/>
+              </ns0:rPr>
+              <ns0:t>|                     TIER 2 : BACK-END (Node.js 22 LTS + Express ESM)                    |</ns0:t>
+            </ns0:r>
+          </ns0:p>
+          <ns0:p>
+            <ns0:pPr>
+              <ns0:spacing ns0:after="20" ns0:before="20"/>
+            </ns0:pPr>
+            <ns0:r>
+              <ns0:rPr>
+                <ns0:rFonts ns0:ascii="Consolas" ns0:hAnsi="Consolas"/>
+                <ns0:color ns0:val="1F4E79"/>
+                <ns0:sz ns0:val="15"/>
+              </ns0:rPr>
+              <ns0:t>|  Pipeline Middlewares Securite :                                                        |</ns0:t>
+            </ns0:r>
+          </ns0:p>
+          <ns0:p>
+            <ns0:pPr>
+              <ns0:spacing ns0:after="20" ns0:before="20"/>
+            </ns0:pPr>
+            <ns0:r>
+              <ns0:rPr>
+                <ns0:rFonts ns0:ascii="Consolas" ns0:hAnsi="Consolas"/>
+                <ns0:color ns0:val="1F4E79"/>
+                <ns0:sz ns0:val="15"/>
+              </ns0:rPr>
+              <ns0:t>|    CORS Filtre  ---&gt;  express.json()  ---&gt;  authenticateToken (JWT)  ---&gt;  requireRole()|</ns0:t>
+            </ns0:r>
+          </ns0:p>
+          <ns0:p>
+            <ns0:pPr>
+              <ns0:spacing ns0:after="20" ns0:before="20"/>
+            </ns0:pPr>
+            <ns0:r>
+              <ns0:rPr>
+                <ns0:rFonts ns0:ascii="Consolas" ns0:hAnsi="Consolas"/>
+                <ns0:color ns0:val="1F4E79"/>
+                <ns0:sz ns0:val="15"/>
+              </ns0:rPr>
+              <ns0:t>|  -------------------------------------------------------------------------------------  |</ns0:t>
+            </ns0:r>
+          </ns0:p>
+          <ns0:p>
+            <ns0:pPr>
+              <ns0:spacing ns0:after="20" ns0:before="20"/>
+            </ns0:pPr>
+            <ns0:r>
+              <ns0:rPr>
+                <ns0:rFonts ns0:ascii="Consolas" ns0:hAnsi="Consolas"/>
+                <ns0:color ns0:val="1F4E79"/>
+                <ns0:sz ns0:val="15"/>
+              </ns0:rPr>
+              <ns0:t>|   Modules &amp; Routeurs Metiers :                                                          |</ns0:t>
+            </ns0:r>
+          </ns0:p>
+          <ns0:p>
+            <ns0:pPr>
+              <ns0:spacing ns0:after="20" ns0:before="20"/>
+            </ns0:pPr>
+            <ns0:r>
+              <ns0:rPr>
+                <ns0:rFonts ns0:ascii="Consolas" ns0:hAnsi="Consolas"/>
+                <ns0:color ns0:val="1F4E79"/>
+                <ns0:sz ns0:val="15"/>
+              </ns0:rPr>
+              <ns0:t>|     • /api/auth &amp; /api/admin   ---&gt; Module P1 (IAM, RBAC, Supervision)                  |</ns0:t>
+            </ns0:r>
+          </ns0:p>
+          <ns0:p>
+            <ns0:pPr>
+              <ns0:spacing ns0:after="20" ns0:before="20"/>
+            </ns0:pPr>
+            <ns0:r>
+              <ns0:rPr>
+                <ns0:rFonts ns0:ascii="Consolas" ns0:hAnsi="Consolas"/>
+                <ns0:color ns0:val="1F4E79"/>
+                <ns0:sz ns0:val="15"/>
+              </ns0:rPr>
+              <ns0:t>|     • /api/datasets            ---&gt; Module P2 (Ingestion, Detection types, Profilage)   |</ns0:t>
+            </ns0:r>
+          </ns0:p>
+          <ns0:p>
+            <ns0:pPr>
+              <ns0:spacing ns0:after="20" ns0:before="20"/>
+            </ns0:pPr>
+            <ns0:r>
+              <ns0:rPr>
+                <ns0:rFonts ns0:ascii="Consolas" ns0:hAnsi="Consolas"/>
+                <ns0:color ns0:val="1F4E79"/>
+                <ns0:sz ns0:val="15"/>
+              </ns0:rPr>
+              <ns0:t>|     • /api/analytics           ---&gt; Module P3 (Moteur analytique SQL, Time-bucketing)   |</ns0:t>
+            </ns0:r>
+          </ns0:p>
+          <ns0:p>
+            <ns0:pPr>
+              <ns0:spacing ns0:after="20" ns0:before="20"/>
+            </ns0:pPr>
+            <ns0:r>
+              <ns0:rPr>
+                <ns0:rFonts ns0:ascii="Consolas" ns0:hAnsi="Consolas"/>
+                <ns0:color ns0:val="1F4E79"/>
+                <ns0:sz ns0:val="15"/>
+              </ns0:rPr>
+              <ns0:t>|     • /api/dashboards,outliers ---&gt; Module P4 (Layouts JSONB, Detection aberrations)    |</ns0:t>
+            </ns0:r>
+          </ns0:p>
+          <ns0:p>
+            <ns0:pPr>
+              <ns0:spacing ns0:after="20" ns0:before="20"/>
+            </ns0:pPr>
+            <ns0:r>
+              <ns0:rPr>
+                <ns0:rFonts ns0:ascii="Consolas" ns0:hAnsi="Consolas"/>
+                <ns0:color ns0:val="1F4E79"/>
+                <ns0:sz ns0:val="15"/>
+              </ns0:rPr>
+              <ns0:t>|     • /api/public/dashboards   ---&gt; Module P4 (Acces public sans auth + Rate-limit)     |</ns0:t>
+            </ns0:r>
+          </ns0:p>
+          <ns0:p>
+            <ns0:pPr>
+              <ns0:spacing ns0:after="20" ns0:before="20"/>
+            </ns0:pPr>
+            <ns0:r>
+              <ns0:rPr>
+                <ns0:rFonts ns0:ascii="Consolas" ns0:hAnsi="Consolas"/>
+                <ns0:color ns0:val="1F4E79"/>
+                <ns0:sz ns0:val="15"/>
+              </ns0:rPr>
+              <ns0:t>|  -------------------------------------------------------------------------------------  |</ns0:t>
+            </ns0:r>
+          </ns0:p>
+          <ns0:p>
+            <ns0:pPr>
+              <ns0:spacing ns0:after="20" ns0:before="20"/>
+            </ns0:pPr>
+            <ns0:r>
+              <ns0:rPr>
+                <ns0:rFonts ns0:ascii="Consolas" ns0:hAnsi="Consolas"/>
+                <ns0:color ns0:val="1F4E79"/>
+                <ns0:sz ns0:val="15"/>
+              </ns0:rPr>
+              <ns0:t>|   Service Transversal d'Audit :                                                         |</ns0:t>
+            </ns0:r>
+          </ns0:p>
+          <ns0:p>
+            <ns0:pPr>
+              <ns0:spacing ns0:after="20" ns0:before="20"/>
+            </ns0:pPr>
+            <ns0:r>
+              <ns0:rPr>
+                <ns0:rFonts ns0:ascii="Consolas" ns0:hAnsi="Consolas"/>
+                <ns0:color ns0:val="1F4E79"/>
+                <ns0:sz ns0:val="15"/>
+              </ns0:rPr>
+              <ns0:t>|     • logActivity(action, entity, details)  ---&gt; Enregistrement Fail-Safe asynchrone    |</ns0:t>
+            </ns0:r>
+          </ns0:p>
+          <ns0:p>
+            <ns0:pPr>
+              <ns0:spacing ns0:after="20" ns0:before="20"/>
+            </ns0:pPr>
+            <ns0:r>
+              <ns0:rPr>
+                <ns0:rFonts ns0:ascii="Consolas" ns0:hAnsi="Consolas"/>
+                <ns0:color ns0:val="1F4E79"/>
+                <ns0:sz ns0:val="15"/>
+              </ns0:rPr>
+              <ns0:t>+---------------------------------------+-------------------------------------------------+</ns0:t>
+            </ns0:r>
+          </ns0:p>
+          <ns0:p>
+            <ns0:pPr>
+              <ns0:spacing ns0:after="20" ns0:before="20"/>
+            </ns0:pPr>
+            <ns0:r>
+              <ns0:rPr>
+                <ns0:rFonts ns0:ascii="Consolas" ns0:hAnsi="Consolas"/>
+                <ns0:color ns0:val="1F4E79"/>
+                <ns0:sz ns0:val="15"/>
+              </ns0:rPr>
+              <ns0:t xml:space="preserve">                                        |                                                  </ns0:t>
+            </ns0:r>
+          </ns0:p>
+          <ns0:p>
+            <ns0:pPr>
+              <ns0:spacing ns0:after="20" ns0:before="20"/>
+            </ns0:pPr>
+            <ns0:r>
+              <ns0:rPr>
+                <ns0:rFonts ns0:ascii="Consolas" ns0:hAnsi="Consolas"/>
+                <ns0:color ns0:val="1F4E79"/>
+                <ns0:sz ns0:val="15"/>
+              </ns0:rPr>
+              <ns0:t xml:space="preserve">                                        | Pool PostgreSQL (pg.Pool / Port 5435)           </ns0:t>
+            </ns0:r>
+          </ns0:p>
+          <ns0:p>
+            <ns0:pPr>
+              <ns0:spacing ns0:after="20" ns0:before="20"/>
+            </ns0:pPr>
+            <ns0:r>
+              <ns0:rPr>
+                <ns0:rFonts ns0:ascii="Consolas" ns0:hAnsi="Consolas"/>
+                <ns0:color ns0:val="1F4E79"/>
+                <ns0:sz ns0:val="15"/>
+              </ns0:rPr>
+              <ns0:t xml:space="preserve">                                        v                                                  </ns0:t>
+            </ns0:r>
+          </ns0:p>
+          <ns0:p>
+            <ns0:pPr>
+              <ns0:spacing ns0:after="20" ns0:before="20"/>
+            </ns0:pPr>
+            <ns0:r>
+              <ns0:rPr>
+                <ns0:rFonts ns0:ascii="Consolas" ns0:hAnsi="Consolas"/>
+                <ns0:color ns0:val="1F4E79"/>
+                <ns0:sz ns0:val="15"/>
+              </ns0:rPr>
+              <ns0:t>+-----------------------------------------------------------------------------------------+</ns0:t>
+            </ns0:r>
+          </ns0:p>
+          <ns0:p>
+            <ns0:pPr>
+              <ns0:spacing ns0:after="20" ns0:before="20"/>
+            </ns0:pPr>
+            <ns0:r>
+              <ns0:rPr>
+                <ns0:rFonts ns0:ascii="Consolas" ns0:hAnsi="Consolas"/>
+                <ns0:color ns0:val="1F4E79"/>
+                <ns0:sz ns0:val="15"/>
+              </ns0:rPr>
+              <ns0:t>|               TIER 3 : BASE DE DONNEES (PostgreSQL 16 Alpine conteneurise)              |</ns0:t>
+            </ns0:r>
+          </ns0:p>
+          <ns0:p>
+            <ns0:pPr>
+              <ns0:spacing ns0:after="20" ns0:before="20"/>
+            </ns0:pPr>
+            <ns0:r>
+              <ns0:rPr>
+                <ns0:rFonts ns0:ascii="Consolas" ns0:hAnsi="Consolas"/>
+                <ns0:color ns0:val="1F4E79"/>
+                <ns0:sz ns0:val="15"/>
+              </ns0:rPr>
+              <ns0:t>|   +-------------------------+-------------------------+-----------------------------+   |</ns0:t>
+            </ns0:r>
+          </ns0:p>
+          <ns0:p>
+            <ns0:pPr>
+              <ns0:spacing ns0:after="20" ns0:before="20"/>
+            </ns0:pPr>
+            <ns0:r>
+              <ns0:rPr>
+                <ns0:rFonts ns0:ascii="Consolas" ns0:hAnsi="Consolas"/>
+                <ns0:color ns0:val="1F4E79"/>
+                <ns0:sz ns0:val="15"/>
+              </ns0:rPr>
+              <ns0:t>|   |       Module P1         |        Module P2        |          Module P4          |   |</ns0:t>
+            </ns0:r>
+          </ns0:p>
+          <ns0:p>
+            <ns0:pPr>
+              <ns0:spacing ns0:after="20" ns0:before="20"/>
+            </ns0:pPr>
+            <ns0:r>
+              <ns0:rPr>
+                <ns0:rFonts ns0:ascii="Consolas" ns0:hAnsi="Consolas"/>
+                <ns0:color ns0:val="1F4E79"/>
+                <ns0:sz ns0:val="15"/>
+              </ns0:rPr>
+              <ns0:t>|   +-------------------------+-------------------------+-----------------------------+   |</ns0:t>
+            </ns0:r>
+          </ns0:p>
+          <ns0:p>
+            <ns0:pPr>
+              <ns0:spacing ns0:after="20" ns0:before="20"/>
+            </ns0:pPr>
+            <ns0:r>
+              <ns0:rPr>
+                <ns0:rFonts ns0:ascii="Consolas" ns0:hAnsi="Consolas"/>
+                <ns0:color ns0:val="1F4E79"/>
+                <ns0:sz ns0:val="15"/>
+              </ns0:rPr>
+              <ns0:t>|   | • users (UUID v4)       | • datasets (SERIAL)     | • analyses (JSONB)          |   |</ns0:t>
+            </ns0:r>
+          </ns0:p>
+          <ns0:p>
+            <ns0:pPr>
+              <ns0:spacing ns0:after="20" ns0:before="20"/>
+            </ns0:pPr>
+            <ns0:r>
+              <ns0:rPr>
+                <ns0:rFonts ns0:ascii="Consolas" ns0:hAnsi="Consolas"/>
+                <ns0:color ns0:val="1F4E79"/>
+                <ns0:sz ns0:val="15"/>
+              </ns0:rPr>
+              <ns0:t>|   | • activity_logs (UUID)  | • dataset_rows (JSONB)  | • analysis_shares (FKs)     |   |</ns0:t>
+            </ns0:r>
+          </ns0:p>
+          <ns0:p>
+            <ns0:pPr>
+              <ns0:spacing ns0:after="20" ns0:before="20"/>
+            </ns0:pPr>
+            <ns0:r>
+              <ns0:rPr>
+                <ns0:rFonts ns0:ascii="Consolas" ns0:hAnsi="Consolas"/>
+                <ns0:color ns0:val="1F4E79"/>
+                <ns0:sz ns0:val="15"/>
+              </ns0:rPr>
+              <ns0:t>|   |                         |                         | • dashboards (JSONB layout) |   |</ns0:t>
+            </ns0:r>
+          </ns0:p>
+          <ns0:p>
+            <ns0:pPr>
+              <ns0:spacing ns0:after="20" ns0:before="20"/>
+            </ns0:pPr>
+            <ns0:r>
+              <ns0:rPr>
+                <ns0:rFonts ns0:ascii="Consolas" ns0:hAnsi="Consolas"/>
+                <ns0:color ns0:val="1F4E79"/>
+                <ns0:sz ns0:val="15"/>
+              </ns0:rPr>
+              <ns0:t>|   |                         |                         | • dashboard_shares (FKs)    |   |</ns0:t>
+            </ns0:r>
+          </ns0:p>
+          <ns0:p>
+            <ns0:pPr>
+              <ns0:spacing ns0:after="20" ns0:before="20"/>
+            </ns0:pPr>
+            <ns0:r>
+              <ns0:rPr>
+                <ns0:rFonts ns0:ascii="Consolas" ns0:hAnsi="Consolas"/>
+                <ns0:color ns0:val="1F4E79"/>
+                <ns0:sz ns0:val="15"/>
+              </ns0:rPr>
+              <ns0:t>|   +-------------------------+-------------------------+-----------------------------+   |</ns0:t>
+            </ns0:r>
+          </ns0:p>
+          <ns0:p>
+            <ns0:pPr>
+              <ns0:spacing ns0:after="20" ns0:before="20"/>
+            </ns0:pPr>
+            <ns0:r>
+              <ns0:rPr>
+                <ns0:rFonts ns0:ascii="Consolas" ns0:hAnsi="Consolas"/>
+                <ns0:color ns0:val="1F4E79"/>
+                <ns0:sz ns0:val="15"/>
+              </ns0:rPr>
+              <ns0:t>|   Conteneur annexe : Adminer Web GUI (Port 8080)                                        |</ns0:t>
+            </ns0:r>
+          </ns0:p>
+          <ns0:p>
+            <ns0:pPr>
+              <ns0:spacing ns0:after="20" ns0:before="20"/>
+            </ns0:pPr>
+            <ns0:r>
+              <ns0:rPr>
+                <ns0:rFonts ns0:ascii="Consolas" ns0:hAnsi="Consolas"/>
+                <ns0:color ns0:val="1F4E79"/>
+                <ns0:sz ns0:val="15"/>
+              </ns0:rPr>
+              <ns0:t>+-----------------------------------------------------------------------------------------+</ns0:t>
+            </ns0:r>
+          </ns0:p>
+        </ns0:tc>
+      </ns0:tr>
+    </ns0:tbl>
+    <ns0:p>
+      <ns0:pPr>
+        <ns0:spacing ns0:after="80"/>
+      </ns0:pPr>
+      <ns0:r>
+        <ns0:rPr/>
+        <ns0:t/>
+      </ns0:r>
+    </ns0:p>
+    <ns0:p>
+      <ns0:pPr>
+        <ns0:pStyle ns0:val="Titre2"/>
+        <ns0:spacing ns0:after="60" ns0:before="200"/>
+      </ns0:pPr>
+      <ns0:r>
+        <ns0:rPr>
+          <ns0:b/>
+        </ns0:rPr>
+        <ns0:t>Matrice des Flux et Protocoles Inter-Couches :</ns0:t>
+      </ns0:r>
+    </ns0:p>
+    <ns0:tbl>
+      <ns0:tblPr>
+        <ns0:tblStyle ns0:val="Tableaudegrille"/>
+        <ns0:tblW ns0:w="9600" ns0:type="dxa"/>
+      </ns0:tblPr>
+      <ns0:tr>
+        <ns0:trPr>
+          <ns0:tblHeader/>
+        </ns0:trPr>
+        <ns0:tc>
+          <ns0:tcPr>
+            <ns0:shd ns0:val="clear" ns0:color="auto" ns0:fill="1F4E79"/>
+            <ns0:tcW ns0:w="1800" ns0:type="dxa"/>
+          </ns0:tcPr>
+          <ns0:p>
+            <ns0:pPr>
+              <ns0:spacing ns0:after="60" ns0:before="60"/>
+            </ns0:pPr>
+            <ns0:r>
+              <ns0:rPr>
+                <ns0:b/>
+                <ns0:color ns0:val="FFFFFF"/>
+              </ns0:rPr>
+              <ns0:t>Flux / Canaux</ns0:t>
+            </ns0:r>
+          </ns0:p>
+        </ns0:tc>
+        <ns0:tc>
+          <ns0:tcPr>
+            <ns0:shd ns0:val="clear" ns0:color="auto" ns0:fill="1F4E79"/>
+            <ns0:tcW ns0:w="1600" ns0:type="dxa"/>
+          </ns0:tcPr>
+          <ns0:p>
+            <ns0:pPr>
+              <ns0:spacing ns0:after="60" ns0:before="60"/>
+            </ns0:pPr>
+            <ns0:r>
+              <ns0:rPr>
+                <ns0:b/>
+                <ns0:color ns0:val="FFFFFF"/>
+              </ns0:rPr>
+              <ns0:t>Source</ns0:t>
+            </ns0:r>
+          </ns0:p>
+        </ns0:tc>
+        <ns0:tc>
+          <ns0:tcPr>
+            <ns0:shd ns0:val="clear" ns0:color="auto" ns0:fill="1F4E79"/>
+            <ns0:tcW ns0:w="1600" ns0:type="dxa"/>
+          </ns0:tcPr>
+          <ns0:p>
+            <ns0:pPr>
+              <ns0:spacing ns0:after="60" ns0:before="60"/>
+            </ns0:pPr>
+            <ns0:r>
+              <ns0:rPr>
+                <ns0:b/>
+                <ns0:color ns0:val="FFFFFF"/>
+              </ns0:rPr>
+              <ns0:t>Destination</ns0:t>
+            </ns0:r>
+          </ns0:p>
+        </ns0:tc>
+        <ns0:tc>
+          <ns0:tcPr>
+            <ns0:shd ns0:val="clear" ns0:color="auto" ns0:fill="1F4E79"/>
+            <ns0:tcW ns0:w="2200" ns0:type="dxa"/>
+          </ns0:tcPr>
+          <ns0:p>
+            <ns0:pPr>
+              <ns0:spacing ns0:after="60" ns0:before="60"/>
+            </ns0:pPr>
+            <ns0:r>
+              <ns0:rPr>
+                <ns0:b/>
+                <ns0:color ns0:val="FFFFFF"/>
+              </ns0:rPr>
+              <ns0:t>Protocole &amp; Sécurité</ns0:t>
+            </ns0:r>
+          </ns0:p>
+        </ns0:tc>
+        <ns0:tc>
+          <ns0:tcPr>
+            <ns0:shd ns0:val="clear" ns0:color="auto" ns0:fill="1F4E79"/>
+            <ns0:tcW ns0:w="2400" ns0:type="dxa"/>
+          </ns0:tcPr>
+          <ns0:p>
+            <ns0:pPr>
+              <ns0:spacing ns0:after="60" ns0:before="60"/>
+            </ns0:pPr>
+            <ns0:r>
+              <ns0:rPr>
+                <ns0:b/>
+                <ns0:color ns0:val="FFFFFF"/>
+              </ns0:rPr>
+              <ns0:t>Données Échangées</ns0:t>
+            </ns0:r>
+          </ns0:p>
+        </ns0:tc>
+      </ns0:tr>
+      <ns0:tr>
+        <ns0:tc>
+          <ns0:tcPr>
+            <ns0:shd ns0:val="clear" ns0:color="auto" ns0:fill="FFFFFF"/>
+            <ns0:tcW ns0:w="1800" ns0:type="dxa"/>
+          </ns0:tcPr>
+          <ns0:p>
+            <ns0:pPr>
+              <ns0:spacing ns0:after="40" ns0:before="40"/>
+            </ns0:pPr>
+            <ns0:r>
+              <ns0:rPr/>
+              <ns0:t>Navigation &amp; Pages</ns0:t>
+            </ns0:r>
+          </ns0:p>
+        </ns0:tc>
+        <ns0:tc>
+          <ns0:tcPr>
+            <ns0:shd ns0:val="clear" ns0:color="auto" ns0:fill="FFFFFF"/>
+            <ns0:tcW ns0:w="1600" ns0:type="dxa"/>
+          </ns0:tcPr>
+          <ns0:p>
+            <ns0:pPr>
+              <ns0:spacing ns0:after="40" ns0:before="40"/>
+            </ns0:pPr>
+            <ns0:r>
+              <ns0:rPr/>
+              <ns0:t>Navigateur Client</ns0:t>
+            </ns0:r>
+          </ns0:p>
+        </ns0:tc>
+        <ns0:tc>
+          <ns0:tcPr>
+            <ns0:shd ns0:val="clear" ns0:color="auto" ns0:fill="FFFFFF"/>
+            <ns0:tcW ns0:w="1600" ns0:type="dxa"/>
+          </ns0:tcPr>
+          <ns0:p>
+            <ns0:pPr>
+              <ns0:spacing ns0:after="40" ns0:before="40"/>
+            </ns0:pPr>
+            <ns0:r>
+              <ns0:rPr/>
+              <ns0:t>Front-end SPA</ns0:t>
+            </ns0:r>
+          </ns0:p>
+        </ns0:tc>
+        <ns0:tc>
+          <ns0:tcPr>
+            <ns0:shd ns0:val="clear" ns0:color="auto" ns0:fill="FFFFFF"/>
+            <ns0:tcW ns0:w="2200" ns0:type="dxa"/>
+          </ns0:tcPr>
+          <ns0:p>
+            <ns0:pPr>
+              <ns0:spacing ns0:after="40" ns0:before="40"/>
+            </ns0:pPr>
+            <ns0:r>
+              <ns0:rPr/>
+              <ns0:t>HTTP / HTTPS (Port 3000)</ns0:t>
+            </ns0:r>
+          </ns0:p>
+        </ns0:tc>
+        <ns0:tc>
+          <ns0:tcPr>
+            <ns0:shd ns0:val="clear" ns0:color="auto" ns0:fill="FFFFFF"/>
+            <ns0:tcW ns0:w="2400" ns0:type="dxa"/>
+          </ns0:tcPr>
+          <ns0:p>
+            <ns0:pPr>
+              <ns0:spacing ns0:after="40" ns0:before="40"/>
+            </ns0:pPr>
+            <ns0:r>
+              <ns0:rPr/>
+              <ns0:t>Code React, bundles Vite, composants Recharts</ns0:t>
+            </ns0:r>
+          </ns0:p>
+        </ns0:tc>
+      </ns0:tr>
+      <ns0:tr>
+        <ns0:tc>
+          <ns0:tcPr>
+            <ns0:shd ns0:val="clear" ns0:color="auto" ns0:fill="F4F7FB"/>
+            <ns0:tcW ns0:w="1800" ns0:type="dxa"/>
+          </ns0:tcPr>
+          <ns0:p>
+            <ns0:pPr>
+              <ns0:spacing ns0:after="40" ns0:before="40"/>
+            </ns0:pPr>
+            <ns0:r>
+              <ns0:rPr/>
+              <ns0:t>Requêtes Métiers</ns0:t>
+            </ns0:r>
+          </ns0:p>
+        </ns0:tc>
+        <ns0:tc>
+          <ns0:tcPr>
+            <ns0:shd ns0:val="clear" ns0:color="auto" ns0:fill="F4F7FB"/>
+            <ns0:tcW ns0:w="1600" ns0:type="dxa"/>
+          </ns0:tcPr>
+          <ns0:p>
+            <ns0:pPr>
+              <ns0:spacing ns0:after="40" ns0:before="40"/>
+            </ns0:pPr>
+            <ns0:r>
+              <ns0:rPr/>
+              <ns0:t>Front-end SPA (Axios)</ns0:t>
+            </ns0:r>
+          </ns0:p>
+        </ns0:tc>
+        <ns0:tc>
+          <ns0:tcPr>
+            <ns0:shd ns0:val="clear" ns0:color="auto" ns0:fill="F4F7FB"/>
+            <ns0:tcW ns0:w="1600" ns0:type="dxa"/>
+          </ns0:tcPr>
+          <ns0:p>
+            <ns0:pPr>
+              <ns0:spacing ns0:after="40" ns0:before="40"/>
+            </ns0:pPr>
+            <ns0:r>
+              <ns0:rPr/>
+              <ns0:t>Back-end Express</ns0:t>
+            </ns0:r>
+          </ns0:p>
+        </ns0:tc>
+        <ns0:tc>
+          <ns0:tcPr>
+            <ns0:shd ns0:val="clear" ns0:color="auto" ns0:fill="F4F7FB"/>
+            <ns0:tcW ns0:w="2200" ns0:type="dxa"/>
+          </ns0:tcPr>
+          <ns0:p>
+            <ns0:pPr>
+              <ns0:spacing ns0:after="40" ns0:before="40"/>
+            </ns0:pPr>
+            <ns0:r>
+              <ns0:rPr/>
+              <ns0:t>HTTP/REST (Port 5000)</ns0:t>
+            </ns0:r>
+          </ns0:p>
+        </ns0:tc>
+        <ns0:tc>
+          <ns0:tcPr>
+            <ns0:shd ns0:val="clear" ns0:color="auto" ns0:fill="F4F7FB"/>
+            <ns0:tcW ns0:w="2400" ns0:type="dxa"/>
+          </ns0:tcPr>
+          <ns0:p>
+            <ns0:pPr>
+              <ns0:spacing ns0:after="40" ns0:before="40"/>
+            </ns0:pPr>
+            <ns0:r>
+              <ns0:rPr/>
+              <ns0:t>En-tête Bearer &lt;JWT&gt;, payloads JSON</ns0:t>
+            </ns0:r>
+          </ns0:p>
+        </ns0:tc>
+      </ns0:tr>
+      <ns0:tr>
+        <ns0:tc>
+          <ns0:tcPr>
+            <ns0:shd ns0:val="clear" ns0:color="auto" ns0:fill="FFFFFF"/>
+            <ns0:tcW ns0:w="1800" ns0:type="dxa"/>
+          </ns0:tcPr>
+          <ns0:p>
+            <ns0:pPr>
+              <ns0:spacing ns0:after="40" ns0:before="40"/>
+            </ns0:pPr>
+            <ns0:r>
+              <ns0:rPr/>
+              <ns0:t>Pipeline Sécuritaire</ns0:t>
+            </ns0:r>
+          </ns0:p>
+        </ns0:tc>
+        <ns0:tc>
+          <ns0:tcPr>
+            <ns0:shd ns0:val="clear" ns0:color="auto" ns0:fill="FFFFFF"/>
+            <ns0:tcW ns0:w="1600" ns0:type="dxa"/>
+          </ns0:tcPr>
+          <ns0:p>
+            <ns0:pPr>
+              <ns0:spacing ns0:after="40" ns0:before="40"/>
+            </ns0:pPr>
+            <ns0:r>
+              <ns0:rPr/>
+              <ns0:t>Express Core</ns0:t>
+            </ns0:r>
+          </ns0:p>
+        </ns0:tc>
+        <ns0:tc>
+          <ns0:tcPr>
+            <ns0:shd ns0:val="clear" ns0:color="auto" ns0:fill="FFFFFF"/>
+            <ns0:tcW ns0:w="1600" ns0:type="dxa"/>
+          </ns0:tcPr>
+          <ns0:p>
+            <ns0:pPr>
+              <ns0:spacing ns0:after="40" ns0:before="40"/>
+            </ns0:pPr>
+            <ns0:r>
+              <ns0:rPr/>
+              <ns0:t>Middlewares P1</ns0:t>
+            </ns0:r>
+          </ns0:p>
+        </ns0:tc>
+        <ns0:tc>
+          <ns0:tcPr>
+            <ns0:shd ns0:val="clear" ns0:color="auto" ns0:fill="FFFFFF"/>
+            <ns0:tcW ns0:w="2200" ns0:type="dxa"/>
+          </ns0:tcPr>
+          <ns0:p>
+            <ns0:pPr>
+              <ns0:spacing ns0:after="40" ns0:before="40"/>
+            </ns0:pPr>
+            <ns0:r>
+              <ns0:rPr/>
+              <ns0:t>In-Process / Express</ns0:t>
+            </ns0:r>
+          </ns0:p>
+        </ns0:tc>
+        <ns0:tc>
+          <ns0:tcPr>
+            <ns0:shd ns0:val="clear" ns0:color="auto" ns0:fill="FFFFFF"/>
+            <ns0:tcW ns0:w="2400" ns0:type="dxa"/>
+          </ns0:tcPr>
+          <ns0:p>
+            <ns0:pPr>
+              <ns0:spacing ns0:after="40" ns0:before="40"/>
+            </ns0:pPr>
+            <ns0:r>
+              <ns0:rPr/>
+              <ns0:t>Décodage JWT, vérification rôle admin, rejet 401/403</ns0:t>
+            </ns0:r>
+          </ns0:p>
+        </ns0:tc>
+      </ns0:tr>
+      <ns0:tr>
+        <ns0:tc>
+          <ns0:tcPr>
+            <ns0:shd ns0:val="clear" ns0:color="auto" ns0:fill="F4F7FB"/>
+            <ns0:tcW ns0:w="1800" ns0:type="dxa"/>
+          </ns0:tcPr>
+          <ns0:p>
+            <ns0:pPr>
+              <ns0:spacing ns0:after="40" ns0:before="40"/>
+            </ns0:pPr>
+            <ns0:r>
+              <ns0:rPr/>
+              <ns0:t>Persistance Données</ns0:t>
+            </ns0:r>
+          </ns0:p>
+        </ns0:tc>
+        <ns0:tc>
+          <ns0:tcPr>
+            <ns0:shd ns0:val="clear" ns0:color="auto" ns0:fill="F4F7FB"/>
+            <ns0:tcW ns0:w="1600" ns0:type="dxa"/>
+          </ns0:tcPr>
+          <ns0:p>
+            <ns0:pPr>
+              <ns0:spacing ns0:after="40" ns0:before="40"/>
+            </ns0:pPr>
+            <ns0:r>
+              <ns0:rPr/>
+              <ns0:t>Modules P1, P2, P3, P4</ns0:t>
+            </ns0:r>
+          </ns0:p>
+        </ns0:tc>
+        <ns0:tc>
+          <ns0:tcPr>
+            <ns0:shd ns0:val="clear" ns0:color="auto" ns0:fill="F4F7FB"/>
+            <ns0:tcW ns0:w="1600" ns0:type="dxa"/>
+          </ns0:tcPr>
+          <ns0:p>
+            <ns0:pPr>
+              <ns0:spacing ns0:after="40" ns0:before="40"/>
+            </ns0:pPr>
+            <ns0:r>
+              <ns0:rPr/>
+              <ns0:t>PostgreSQL 16</ns0:t>
+            </ns0:r>
+          </ns0:p>
+        </ns0:tc>
+        <ns0:tc>
+          <ns0:tcPr>
+            <ns0:shd ns0:val="clear" ns0:color="auto" ns0:fill="F4F7FB"/>
+            <ns0:tcW ns0:w="2200" ns0:type="dxa"/>
+          </ns0:tcPr>
+          <ns0:p>
+            <ns0:pPr>
+              <ns0:spacing ns0:after="40" ns0:before="40"/>
+            </ns0:pPr>
+            <ns0:r>
+              <ns0:rPr/>
+              <ns0:t>TCP / pg.Pool (Port 5435)</ns0:t>
+            </ns0:r>
+          </ns0:p>
+        </ns0:tc>
+        <ns0:tc>
+          <ns0:tcPr>
+            <ns0:shd ns0:val="clear" ns0:color="auto" ns0:fill="F4F7FB"/>
+            <ns0:tcW ns0:w="2400" ns0:type="dxa"/>
+          </ns0:tcPr>
+          <ns0:p>
+            <ns0:pPr>
+              <ns0:spacing ns0:after="40" ns0:before="40"/>
+            </ns0:pPr>
+            <ns0:r>
+              <ns0:rPr/>
+              <ns0:t>Requêtes SQL préparées ($1, $2), JSONB, transactions</ns0:t>
+            </ns0:r>
+          </ns0:p>
+        </ns0:tc>
+      </ns0:tr>
+      <ns0:tr>
+        <ns0:tc>
+          <ns0:tcPr>
+            <ns0:shd ns0:val="clear" ns0:color="auto" ns0:fill="FFFFFF"/>
+            <ns0:tcW ns0:w="1800" ns0:type="dxa"/>
+          </ns0:tcPr>
+          <ns0:p>
+            <ns0:pPr>
+              <ns0:spacing ns0:after="40" ns0:before="40"/>
+            </ns0:pPr>
+            <ns0:r>
+              <ns0:rPr/>
+              <ns0:t>Piste d'Audit</ns0:t>
+            </ns0:r>
+          </ns0:p>
+        </ns0:tc>
+        <ns0:tc>
+          <ns0:tcPr>
+            <ns0:shd ns0:val="clear" ns0:color="auto" ns0:fill="FFFFFF"/>
+            <ns0:tcW ns0:w="1600" ns0:type="dxa"/>
+          </ns0:tcPr>
+          <ns0:p>
+            <ns0:pPr>
+              <ns0:spacing ns0:after="40" ns0:before="40"/>
+            </ns0:pPr>
+            <ns0:r>
+              <ns0:rPr/>
+              <ns0:t>Tous Modules Métiers</ns0:t>
+            </ns0:r>
+          </ns0:p>
+        </ns0:tc>
+        <ns0:tc>
+          <ns0:tcPr>
+            <ns0:shd ns0:val="clear" ns0:color="auto" ns0:fill="FFFFFF"/>
+            <ns0:tcW ns0:w="1600" ns0:type="dxa"/>
+          </ns0:tcPr>
+          <ns0:p>
+            <ns0:pPr>
+              <ns0:spacing ns0:after="40" ns0:before="40"/>
+            </ns0:pPr>
+            <ns0:r>
+              <ns0:rPr/>
+              <ns0:t>Service logActivity()</ns0:t>
+            </ns0:r>
+          </ns0:p>
+        </ns0:tc>
+        <ns0:tc>
+          <ns0:tcPr>
+            <ns0:shd ns0:val="clear" ns0:color="auto" ns0:fill="FFFFFF"/>
+            <ns0:tcW ns0:w="2200" ns0:type="dxa"/>
+          </ns0:tcPr>
+          <ns0:p>
+            <ns0:pPr>
+              <ns0:spacing ns0:after="40" ns0:before="40"/>
+            </ns0:pPr>
+            <ns0:r>
+              <ns0:rPr/>
+              <ns0:t>Appel fonctionnel asynchrone</ns0:t>
+            </ns0:r>
+          </ns0:p>
+        </ns0:tc>
+        <ns0:tc>
+          <ns0:tcPr>
+            <ns0:shd ns0:val="clear" ns0:color="auto" ns0:fill="FFFFFF"/>
+            <ns0:tcW ns0:w="2400" ns0:type="dxa"/>
+          </ns0:tcPr>
+          <ns0:p>
+            <ns0:pPr>
+              <ns0:spacing ns0:after="40" ns0:before="40"/>
+            </ns0:pPr>
+            <ns0:r>
+              <ns0:rPr/>
+              <ns0:t>IP, User-Agent, action, entité, détails JSONB</ns0:t>
+            </ns0:r>
+          </ns0:p>
+        </ns0:tc>
+      </ns0:tr>
+      <ns0:tr>
+        <ns0:tc>
+          <ns0:tcPr>
+            <ns0:shd ns0:val="clear" ns0:color="auto" ns0:fill="F4F7FB"/>
+            <ns0:tcW ns0:w="1800" ns0:type="dxa"/>
+          </ns0:tcPr>
+          <ns0:p>
+            <ns0:pPr>
+              <ns0:spacing ns0:after="40" ns0:before="40"/>
+            </ns0:pPr>
+            <ns0:r>
+              <ns0:rPr/>
+              <ns0:t>Administration BDD</ns0:t>
+            </ns0:r>
+          </ns0:p>
+        </ns0:tc>
+        <ns0:tc>
+          <ns0:tcPr>
+            <ns0:shd ns0:val="clear" ns0:color="auto" ns0:fill="F4F7FB"/>
+            <ns0:tcW ns0:w="1600" ns0:type="dxa"/>
+          </ns0:tcPr>
+          <ns0:p>
+            <ns0:pPr>
+              <ns0:spacing ns0:after="40" ns0:before="40"/>
+            </ns0:pPr>
+            <ns0:r>
+              <ns0:rPr/>
+              <ns0:t>Administrateur Système</ns0:t>
+            </ns0:r>
+          </ns0:p>
+        </ns0:tc>
+        <ns0:tc>
+          <ns0:tcPr>
+            <ns0:shd ns0:val="clear" ns0:color="auto" ns0:fill="F4F7FB"/>
+            <ns0:tcW ns0:w="1600" ns0:type="dxa"/>
+          </ns0:tcPr>
+          <ns0:p>
+            <ns0:pPr>
+              <ns0:spacing ns0:after="40" ns0:before="40"/>
+            </ns0:pPr>
+            <ns0:r>
+              <ns0:rPr/>
+              <ns0:t>Adminer GUI</ns0:t>
+            </ns0:r>
+          </ns0:p>
+        </ns0:tc>
+        <ns0:tc>
+          <ns0:tcPr>
+            <ns0:shd ns0:val="clear" ns0:color="auto" ns0:fill="F4F7FB"/>
+            <ns0:tcW ns0:w="2200" ns0:type="dxa"/>
+          </ns0:tcPr>
+          <ns0:p>
+            <ns0:pPr>
+              <ns0:spacing ns0:after="40" ns0:before="40"/>
+            </ns0:pPr>
+            <ns0:r>
+              <ns0:rPr/>
+              <ns0:t>HTTP (Port 8080)</ns0:t>
+            </ns0:r>
+          </ns0:p>
+        </ns0:tc>
+        <ns0:tc>
+          <ns0:tcPr>
+            <ns0:shd ns0:val="clear" ns0:color="auto" ns0:fill="F4F7FB"/>
+            <ns0:tcW ns0:w="2400" ns0:type="dxa"/>
+          </ns0:tcPr>
+          <ns0:p>
+            <ns0:pPr>
+              <ns0:spacing ns0:after="40" ns0:before="40"/>
+            </ns0:pPr>
+            <ns0:r>
+              <ns0:rPr/>
+              <ns0:t>Inspection visuelle des 8 tables et requêtes SQL manuelles</ns0:t>
+            </ns0:r>
+          </ns0:p>
+        </ns0:tc>
+      </ns0:tr>
+    </ns0:tbl>
+    <ns0:p>
+      <ns0:pPr>
+        <ns0:spacing ns0:after="120"/>
+      </ns0:pPr>
+      <ns0:r>
+        <ns0:rPr/>
+        <ns0:t/>
       </ns0:r>
     </ns0:p>
     <ns0:p>

</xml_diff>